<commit_message>
Prebiehajuca sezona sa vykazuje ako rozbeh, nie ako pocet odstupenych klubov
Sezona 2026/2027 sa pridava do dokumentov, portalu aj ETL, ale VZDY len ako rozbeh. Novy blok rozbeh v data/odstupene-kluby.json (funkcia rozbeh_sezony): 145 z 397 sutazi, 1024 z 1401 klubov, 382 klubov zatial bez zapasu. Rozbeh po kategoriach dokazuje, preco sa sezona hodnotit neda: dospeli 76,3 %, dorast 60,6 %, ziaci 25,8 %, pripravky 1,9 %. Pravidlo zapisane v docs/metodika.md. Portal /trendy, interaktivny prehlad, DOCX aj infografika dostali poznamku, ze 382 NIE JE pocet odstupenych klubov. etl/odstupene_kluby.py zaradeny do tyzdennej automatiky (krok 11b po sumar.py).
</commit_message>
<xml_diff>
--- a/docs/obrazky/odstupene-kluby/Odstupene-kluby-analyza.docx
+++ b/docs/obrazky/odstupene-kluby/Odstupene-kluby-analyza.docx
@@ -97,7 +97,7 @@
         <w:rPr>
           <w:rFonts w:ascii="Calibri" w:cs="Calibri" w:eastAsia="Calibri" w:hAnsi="Calibri"/>
         </w:rPr>
-        <w:t xml:space="preserve"> Zadanie prišlo ako „štatistika odhlásených klubov za posledných 5 rokov“ s cieľom vyvrátiť rétoriku, že sa kluby hromadne odhlásili tento rok — či už pre zmeny v RaPP, alebo pre nevyplatené finančné záväzky zo strany SFZ.</w:t>
+        <w:t xml:space="preserve"> Dáta z prepočtu 19. 8. 2026 vrátane rozbehu sezóny 2026/2027. Zadanie prišlo ako „štatistika odhlásených klubov za posledných 5 rokov“ s cieľom vyvrátiť rétoriku, že sa kluby hromadne odhlásili tento rok — či už pre zmeny v RaPP, alebo pre nevyplatené finančné záväzky zo strany SFZ.</w:t>
       </w:r>
     </w:p>
     <w:p>
@@ -152,7 +152,7 @@
         </w:rPr>
         <w:t xml:space="preserve">. Overiteľné na </w:t>
       </w:r>
-      <w:hyperlink w:history="1" r:id="rIdac8bafscxx9knoeoc6lfk">
+      <w:hyperlink w:history="1" r:id="rId6hjtyk5mch0bjofpmapqb">
         <w:r>
           <w:rPr>
             <w:rFonts w:ascii="Calibri" w:cs="Calibri" w:eastAsia="Calibri" w:hAnsi="Calibri"/>
@@ -515,6 +515,11 @@
           <w:rFonts w:ascii="Calibri" w:cs="Calibri" w:eastAsia="Calibri" w:hAnsi="Calibri"/>
         </w:rPr>
         <w:t xml:space="preserve"> — mládežnícke súťaže sa rozbiehajú neskôr, takže klub, ktorý ešte len čaká na štart svojej súťaže, by vyšiel ako odstúpený. Preregistrácie klubu (nové IČO) sa spájajú s predchodcom, inak by preregistrácia vyšla ako strata všetkých družstiev.</w:t>
+      </w:r>
+    </w:p>
+    <w:p>
+      <w:r>
+        <w:br w:type="page"/>
       </w:r>
     </w:p>
     <w:p>
@@ -1737,7 +1742,6 @@
         <w:tc>
           <w:tcPr>
             <w:tcW w:type="dxa" w:w="100"/>
-            <w:shd w:fill="FDECEC" w:val="clear"/>
             <w:tcMar>
               <w:top w:type="dxa" w:w="70"/>
               <w:left w:type="dxa" w:w="110"/>
@@ -1766,7 +1770,6 @@
         <w:tc>
           <w:tcPr>
             <w:tcW w:type="dxa" w:w="100"/>
-            <w:shd w:fill="FDECEC" w:val="clear"/>
             <w:tcMar>
               <w:top w:type="dxa" w:w="70"/>
               <w:left w:type="dxa" w:w="110"/>
@@ -1795,24 +1798,21 @@
         <w:tc>
           <w:tcPr>
             <w:tcW w:type="dxa" w:w="100"/>
-            <w:shd w:fill="FDECEC" w:val="clear"/>
-            <w:tcMar>
-              <w:top w:type="dxa" w:w="70"/>
-              <w:left w:type="dxa" w:w="110"/>
-              <w:bottom w:type="dxa" w:w="70"/>
-              <w:right w:type="dxa" w:w="110"/>
-            </w:tcMar>
-          </w:tcPr>
-          <w:p>
-            <w:pPr>
-              <w:spacing w:after="0"/>
-              <w:jc w:val="center"/>
-            </w:pPr>
-            <w:r>
-              <w:rPr>
-                <w:rFonts w:ascii="Calibri" w:cs="Calibri" w:eastAsia="Calibri" w:hAnsi="Calibri"/>
-                <w:b/>
-                <w:bCs/>
+            <w:tcMar>
+              <w:top w:type="dxa" w:w="70"/>
+              <w:left w:type="dxa" w:w="110"/>
+              <w:bottom w:type="dxa" w:w="70"/>
+              <w:right w:type="dxa" w:w="110"/>
+            </w:tcMar>
+          </w:tcPr>
+          <w:p>
+            <w:pPr>
+              <w:spacing w:after="0"/>
+              <w:jc w:val="center"/>
+            </w:pPr>
+            <w:r>
+              <w:rPr>
+                <w:rFonts w:ascii="Calibri" w:cs="Calibri" w:eastAsia="Calibri" w:hAnsi="Calibri"/>
                 <w:color w:val="0F172A"/>
                 <w:sz w:val="19"/>
                 <w:szCs w:val="19"/>
@@ -1824,29 +1824,132 @@
         <w:tc>
           <w:tcPr>
             <w:tcW w:type="dxa" w:w="100"/>
-            <w:shd w:fill="FDECEC" w:val="clear"/>
-            <w:tcMar>
-              <w:top w:type="dxa" w:w="70"/>
-              <w:left w:type="dxa" w:w="110"/>
-              <w:bottom w:type="dxa" w:w="70"/>
-              <w:right w:type="dxa" w:w="110"/>
-            </w:tcMar>
-          </w:tcPr>
-          <w:p>
-            <w:pPr>
-              <w:spacing w:after="0"/>
-              <w:jc w:val="center"/>
-            </w:pPr>
-            <w:r>
-              <w:rPr>
-                <w:rFonts w:ascii="Calibri" w:cs="Calibri" w:eastAsia="Calibri" w:hAnsi="Calibri"/>
-                <w:b/>
-                <w:bCs/>
+            <w:tcMar>
+              <w:top w:type="dxa" w:w="70"/>
+              <w:left w:type="dxa" w:w="110"/>
+              <w:bottom w:type="dxa" w:w="70"/>
+              <w:right w:type="dxa" w:w="110"/>
+            </w:tcMar>
+          </w:tcPr>
+          <w:p>
+            <w:pPr>
+              <w:spacing w:after="0"/>
+              <w:jc w:val="center"/>
+            </w:pPr>
+            <w:r>
+              <w:rPr>
+                <w:rFonts w:ascii="Calibri" w:cs="Calibri" w:eastAsia="Calibri" w:hAnsi="Calibri"/>
                 <w:color w:val="0F172A"/>
                 <w:sz w:val="19"/>
                 <w:szCs w:val="19"/>
               </w:rPr>
               <w:t xml:space="preserve">zatiaľ nevieme</w:t>
+            </w:r>
+          </w:p>
+        </w:tc>
+      </w:tr>
+      <w:tr>
+        <w:tc>
+          <w:tcPr>
+            <w:tcW w:type="dxa" w:w="100"/>
+            <w:tcMar>
+              <w:top w:type="dxa" w:w="70"/>
+              <w:left w:type="dxa" w:w="110"/>
+              <w:bottom w:type="dxa" w:w="70"/>
+              <w:right w:type="dxa" w:w="110"/>
+            </w:tcMar>
+          </w:tcPr>
+          <w:p>
+            <w:pPr>
+              <w:spacing w:after="0"/>
+              <w:jc w:val="left"/>
+            </w:pPr>
+            <w:r>
+              <w:rPr>
+                <w:rFonts w:ascii="Calibri" w:cs="Calibri" w:eastAsia="Calibri" w:hAnsi="Calibri"/>
+                <w:color w:val="0F172A"/>
+                <w:sz w:val="19"/>
+                <w:szCs w:val="19"/>
+              </w:rPr>
+              <w:t xml:space="preserve">2026/2027 (sezóna sa iba začína)</w:t>
+            </w:r>
+          </w:p>
+        </w:tc>
+        <w:tc>
+          <w:tcPr>
+            <w:tcW w:type="dxa" w:w="100"/>
+            <w:tcMar>
+              <w:top w:type="dxa" w:w="70"/>
+              <w:left w:type="dxa" w:w="110"/>
+              <w:bottom w:type="dxa" w:w="70"/>
+              <w:right w:type="dxa" w:w="110"/>
+            </w:tcMar>
+          </w:tcPr>
+          <w:p>
+            <w:pPr>
+              <w:spacing w:after="0"/>
+              <w:jc w:val="center"/>
+            </w:pPr>
+            <w:r>
+              <w:rPr>
+                <w:rFonts w:ascii="Calibri" w:cs="Calibri" w:eastAsia="Calibri" w:hAnsi="Calibri"/>
+                <w:color w:val="0F172A"/>
+                <w:sz w:val="19"/>
+                <w:szCs w:val="19"/>
+              </w:rPr>
+              <w:t xml:space="preserve">—</w:t>
+            </w:r>
+          </w:p>
+        </w:tc>
+        <w:tc>
+          <w:tcPr>
+            <w:tcW w:type="dxa" w:w="100"/>
+            <w:tcMar>
+              <w:top w:type="dxa" w:w="70"/>
+              <w:left w:type="dxa" w:w="110"/>
+              <w:bottom w:type="dxa" w:w="70"/>
+              <w:right w:type="dxa" w:w="110"/>
+            </w:tcMar>
+          </w:tcPr>
+          <w:p>
+            <w:pPr>
+              <w:spacing w:after="0"/>
+              <w:jc w:val="center"/>
+            </w:pPr>
+            <w:r>
+              <w:rPr>
+                <w:rFonts w:ascii="Calibri" w:cs="Calibri" w:eastAsia="Calibri" w:hAnsi="Calibri"/>
+                <w:color w:val="0F172A"/>
+                <w:sz w:val="19"/>
+                <w:szCs w:val="19"/>
+              </w:rPr>
+              <w:t xml:space="preserve">—</w:t>
+            </w:r>
+          </w:p>
+        </w:tc>
+        <w:tc>
+          <w:tcPr>
+            <w:tcW w:type="dxa" w:w="100"/>
+            <w:tcMar>
+              <w:top w:type="dxa" w:w="70"/>
+              <w:left w:type="dxa" w:w="110"/>
+              <w:bottom w:type="dxa" w:w="70"/>
+              <w:right w:type="dxa" w:w="110"/>
+            </w:tcMar>
+          </w:tcPr>
+          <w:p>
+            <w:pPr>
+              <w:spacing w:after="0"/>
+              <w:jc w:val="center"/>
+            </w:pPr>
+            <w:r>
+              <w:rPr>
+                <w:rFonts w:ascii="Calibri" w:cs="Calibri" w:eastAsia="Calibri" w:hAnsi="Calibri"/>
+                <w:color w:val="0F172A"/>
+                <w:sz w:val="19"/>
+                <w:szCs w:val="19"/>
+              </w:rPr>
+              <w:t xml:space="preserve">—</w:t>
             </w:r>
           </w:p>
         </w:tc>
@@ -2010,6 +2113,1242 @@
     </w:p>
     <w:p>
       <w:pPr>
+        <w:pStyle w:val="Heading2"/>
+        <w:spacing w:after="120" w:before="260"/>
+      </w:pPr>
+      <w:r>
+        <w:rPr>
+          <w:rFonts w:ascii="Calibri" w:cs="Calibri" w:eastAsia="Calibri" w:hAnsi="Calibri"/>
+          <w:b/>
+          <w:bCs/>
+          <w:color w:val="1450DF"/>
+          <w:sz w:val="24"/>
+          <w:szCs w:val="24"/>
+        </w:rPr>
+        <w:t xml:space="preserve">Sezóna 2026/2027 — prvé kolá sa odohrali, hodnotiť sa ešte nedá</w:t>
+      </w:r>
+    </w:p>
+    <w:p>
+      <w:pPr>
+        <w:spacing w:after="140" w:line="276"/>
+      </w:pPr>
+      <w:r>
+        <w:rPr>
+          <w:rFonts w:ascii="Calibri" w:cs="Calibri" w:eastAsia="Calibri" w:hAnsi="Calibri"/>
+        </w:rPr>
+        <w:t xml:space="preserve">Prvé kolá sezóny 2026/2027 sú za nami, preto ju v tabuľke uvádzame — ale </w:t>
+      </w:r>
+      <w:r>
+        <w:rPr>
+          <w:rFonts w:ascii="Calibri" w:cs="Calibri" w:eastAsia="Calibri" w:hAnsi="Calibri"/>
+          <w:b/>
+          <w:bCs/>
+        </w:rPr>
+        <w:t xml:space="preserve">len ako rozbeh, nie ako počet odstúpených klubov.</w:t>
+      </w:r>
+      <w:r>
+        <w:rPr>
+          <w:rFonts w:ascii="Calibri" w:cs="Calibri" w:eastAsia="Calibri" w:hAnsi="Calibri"/>
+        </w:rPr>
+        <w:t xml:space="preserve"> Stav k prepočtu z 19. 8. 2026:</w:t>
+      </w:r>
+    </w:p>
+    <w:tbl>
+      <w:tblPr>
+        <w:tblW w:type="dxa" w:w="9070"/>
+        <w:tblBorders>
+          <w:top w:val="single" w:color="E2E8F0" w:sz="4"/>
+          <w:left w:val="none"/>
+          <w:bottom w:val="single" w:color="E2E8F0" w:sz="4"/>
+          <w:right w:val="none"/>
+          <w:insideH w:val="single" w:color="E2E8F0" w:sz="2"/>
+          <w:insideV w:val="none"/>
+        </w:tblBorders>
+      </w:tblPr>
+      <w:tblGrid>
+        <w:gridCol w:w="3470"/>
+        <w:gridCol w:w="1900"/>
+        <w:gridCol w:w="1900"/>
+        <w:gridCol w:w="1800"/>
+      </w:tblGrid>
+      <w:tr>
+        <w:trPr>
+          <w:tblHeader/>
+        </w:trPr>
+        <w:tc>
+          <w:tcPr>
+            <w:tcW w:type="dxa" w:w="100"/>
+            <w:shd w:fill="EEF2F6" w:val="clear"/>
+            <w:tcMar>
+              <w:top w:type="dxa" w:w="70"/>
+              <w:left w:type="dxa" w:w="110"/>
+              <w:bottom w:type="dxa" w:w="70"/>
+              <w:right w:type="dxa" w:w="110"/>
+            </w:tcMar>
+          </w:tcPr>
+          <w:p>
+            <w:pPr>
+              <w:spacing w:after="0"/>
+              <w:jc w:val="left"/>
+            </w:pPr>
+            <w:r>
+              <w:rPr>
+                <w:rFonts w:ascii="Calibri" w:cs="Calibri" w:eastAsia="Calibri" w:hAnsi="Calibri"/>
+                <w:b/>
+                <w:bCs/>
+                <w:color w:val="0F172A"/>
+                <w:sz w:val="19"/>
+                <w:szCs w:val="19"/>
+              </w:rPr>
+              <w:t xml:space="preserve">Ukazovateľ</w:t>
+            </w:r>
+          </w:p>
+        </w:tc>
+        <w:tc>
+          <w:tcPr>
+            <w:tcW w:type="dxa" w:w="100"/>
+            <w:shd w:fill="EEF2F6" w:val="clear"/>
+            <w:tcMar>
+              <w:top w:type="dxa" w:w="70"/>
+              <w:left w:type="dxa" w:w="110"/>
+              <w:bottom w:type="dxa" w:w="70"/>
+              <w:right w:type="dxa" w:w="110"/>
+            </w:tcMar>
+          </w:tcPr>
+          <w:p>
+            <w:pPr>
+              <w:spacing w:after="0"/>
+              <w:jc w:val="center"/>
+            </w:pPr>
+            <w:r>
+              <w:rPr>
+                <w:rFonts w:ascii="Calibri" w:cs="Calibri" w:eastAsia="Calibri" w:hAnsi="Calibri"/>
+                <w:b/>
+                <w:bCs/>
+                <w:color w:val="0F172A"/>
+                <w:sz w:val="19"/>
+                <w:szCs w:val="19"/>
+              </w:rPr>
+              <w:t xml:space="preserve">2026/2027</w:t>
+            </w:r>
+          </w:p>
+        </w:tc>
+        <w:tc>
+          <w:tcPr>
+            <w:tcW w:type="dxa" w:w="100"/>
+            <w:shd w:fill="EEF2F6" w:val="clear"/>
+            <w:tcMar>
+              <w:top w:type="dxa" w:w="70"/>
+              <w:left w:type="dxa" w:w="110"/>
+              <w:bottom w:type="dxa" w:w="70"/>
+              <w:right w:type="dxa" w:w="110"/>
+            </w:tcMar>
+          </w:tcPr>
+          <w:p>
+            <w:pPr>
+              <w:spacing w:after="0"/>
+              <w:jc w:val="center"/>
+            </w:pPr>
+            <w:r>
+              <w:rPr>
+                <w:rFonts w:ascii="Calibri" w:cs="Calibri" w:eastAsia="Calibri" w:hAnsi="Calibri"/>
+                <w:b/>
+                <w:bCs/>
+                <w:color w:val="0F172A"/>
+                <w:sz w:val="19"/>
+                <w:szCs w:val="19"/>
+              </w:rPr>
+              <w:t xml:space="preserve">2025/2026 (celá)</w:t>
+            </w:r>
+          </w:p>
+        </w:tc>
+        <w:tc>
+          <w:tcPr>
+            <w:tcW w:type="dxa" w:w="100"/>
+            <w:shd w:fill="EEF2F6" w:val="clear"/>
+            <w:tcMar>
+              <w:top w:type="dxa" w:w="70"/>
+              <w:left w:type="dxa" w:w="110"/>
+              <w:bottom w:type="dxa" w:w="70"/>
+              <w:right w:type="dxa" w:w="110"/>
+            </w:tcMar>
+          </w:tcPr>
+          <w:p>
+            <w:pPr>
+              <w:spacing w:after="0"/>
+              <w:jc w:val="center"/>
+            </w:pPr>
+            <w:r>
+              <w:rPr>
+                <w:rFonts w:ascii="Calibri" w:cs="Calibri" w:eastAsia="Calibri" w:hAnsi="Calibri"/>
+                <w:b/>
+                <w:bCs/>
+                <w:color w:val="0F172A"/>
+                <w:sz w:val="19"/>
+                <w:szCs w:val="19"/>
+              </w:rPr>
+              <w:t xml:space="preserve">Rozbeh</w:t>
+            </w:r>
+          </w:p>
+        </w:tc>
+      </w:tr>
+      <w:tr>
+        <w:tc>
+          <w:tcPr>
+            <w:tcW w:type="dxa" w:w="100"/>
+            <w:tcMar>
+              <w:top w:type="dxa" w:w="70"/>
+              <w:left w:type="dxa" w:w="110"/>
+              <w:bottom w:type="dxa" w:w="70"/>
+              <w:right w:type="dxa" w:w="110"/>
+            </w:tcMar>
+          </w:tcPr>
+          <w:p>
+            <w:pPr>
+              <w:spacing w:after="0"/>
+              <w:jc w:val="left"/>
+            </w:pPr>
+            <w:r>
+              <w:rPr>
+                <w:rFonts w:ascii="Calibri" w:cs="Calibri" w:eastAsia="Calibri" w:hAnsi="Calibri"/>
+                <w:color w:val="0F172A"/>
+                <w:sz w:val="19"/>
+                <w:szCs w:val="19"/>
+              </w:rPr>
+              <w:t xml:space="preserve">Súťaže s uzavretým zápasom</w:t>
+            </w:r>
+          </w:p>
+        </w:tc>
+        <w:tc>
+          <w:tcPr>
+            <w:tcW w:type="dxa" w:w="100"/>
+            <w:tcMar>
+              <w:top w:type="dxa" w:w="70"/>
+              <w:left w:type="dxa" w:w="110"/>
+              <w:bottom w:type="dxa" w:w="70"/>
+              <w:right w:type="dxa" w:w="110"/>
+            </w:tcMar>
+          </w:tcPr>
+          <w:p>
+            <w:pPr>
+              <w:spacing w:after="0"/>
+              <w:jc w:val="center"/>
+            </w:pPr>
+            <w:r>
+              <w:rPr>
+                <w:rFonts w:ascii="Calibri" w:cs="Calibri" w:eastAsia="Calibri" w:hAnsi="Calibri"/>
+                <w:color w:val="0F172A"/>
+                <w:sz w:val="19"/>
+                <w:szCs w:val="19"/>
+              </w:rPr>
+              <w:t xml:space="preserve">145</w:t>
+            </w:r>
+          </w:p>
+        </w:tc>
+        <w:tc>
+          <w:tcPr>
+            <w:tcW w:type="dxa" w:w="100"/>
+            <w:tcMar>
+              <w:top w:type="dxa" w:w="70"/>
+              <w:left w:type="dxa" w:w="110"/>
+              <w:bottom w:type="dxa" w:w="70"/>
+              <w:right w:type="dxa" w:w="110"/>
+            </w:tcMar>
+          </w:tcPr>
+          <w:p>
+            <w:pPr>
+              <w:spacing w:after="0"/>
+              <w:jc w:val="center"/>
+            </w:pPr>
+            <w:r>
+              <w:rPr>
+                <w:rFonts w:ascii="Calibri" w:cs="Calibri" w:eastAsia="Calibri" w:hAnsi="Calibri"/>
+                <w:color w:val="0F172A"/>
+                <w:sz w:val="19"/>
+                <w:szCs w:val="19"/>
+              </w:rPr>
+              <w:t xml:space="preserve">397</w:t>
+            </w:r>
+          </w:p>
+        </w:tc>
+        <w:tc>
+          <w:tcPr>
+            <w:tcW w:type="dxa" w:w="100"/>
+            <w:tcMar>
+              <w:top w:type="dxa" w:w="70"/>
+              <w:left w:type="dxa" w:w="110"/>
+              <w:bottom w:type="dxa" w:w="70"/>
+              <w:right w:type="dxa" w:w="110"/>
+            </w:tcMar>
+          </w:tcPr>
+          <w:p>
+            <w:pPr>
+              <w:spacing w:after="0"/>
+              <w:jc w:val="center"/>
+            </w:pPr>
+            <w:r>
+              <w:rPr>
+                <w:rFonts w:ascii="Calibri" w:cs="Calibri" w:eastAsia="Calibri" w:hAnsi="Calibri"/>
+                <w:color w:val="0F172A"/>
+                <w:sz w:val="19"/>
+                <w:szCs w:val="19"/>
+              </w:rPr>
+              <w:t xml:space="preserve">36,5 %</w:t>
+            </w:r>
+          </w:p>
+        </w:tc>
+      </w:tr>
+      <w:tr>
+        <w:tc>
+          <w:tcPr>
+            <w:tcW w:type="dxa" w:w="100"/>
+            <w:tcMar>
+              <w:top w:type="dxa" w:w="70"/>
+              <w:left w:type="dxa" w:w="110"/>
+              <w:bottom w:type="dxa" w:w="70"/>
+              <w:right w:type="dxa" w:w="110"/>
+            </w:tcMar>
+          </w:tcPr>
+          <w:p>
+            <w:pPr>
+              <w:spacing w:after="0"/>
+              <w:jc w:val="left"/>
+            </w:pPr>
+            <w:r>
+              <w:rPr>
+                <w:rFonts w:ascii="Calibri" w:cs="Calibri" w:eastAsia="Calibri" w:hAnsi="Calibri"/>
+                <w:color w:val="0F172A"/>
+                <w:sz w:val="19"/>
+                <w:szCs w:val="19"/>
+              </w:rPr>
+              <w:t xml:space="preserve">Odohrané zápasy</w:t>
+            </w:r>
+          </w:p>
+        </w:tc>
+        <w:tc>
+          <w:tcPr>
+            <w:tcW w:type="dxa" w:w="100"/>
+            <w:tcMar>
+              <w:top w:type="dxa" w:w="70"/>
+              <w:left w:type="dxa" w:w="110"/>
+              <w:bottom w:type="dxa" w:w="70"/>
+              <w:right w:type="dxa" w:w="110"/>
+            </w:tcMar>
+          </w:tcPr>
+          <w:p>
+            <w:pPr>
+              <w:spacing w:after="0"/>
+              <w:jc w:val="center"/>
+            </w:pPr>
+            <w:r>
+              <w:rPr>
+                <w:rFonts w:ascii="Calibri" w:cs="Calibri" w:eastAsia="Calibri" w:hAnsi="Calibri"/>
+                <w:color w:val="0F172A"/>
+                <w:sz w:val="19"/>
+                <w:szCs w:val="19"/>
+              </w:rPr>
+              <w:t xml:space="preserve">1 757</w:t>
+            </w:r>
+          </w:p>
+        </w:tc>
+        <w:tc>
+          <w:tcPr>
+            <w:tcW w:type="dxa" w:w="100"/>
+            <w:tcMar>
+              <w:top w:type="dxa" w:w="70"/>
+              <w:left w:type="dxa" w:w="110"/>
+              <w:bottom w:type="dxa" w:w="70"/>
+              <w:right w:type="dxa" w:w="110"/>
+            </w:tcMar>
+          </w:tcPr>
+          <w:p>
+            <w:pPr>
+              <w:spacing w:after="0"/>
+              <w:jc w:val="center"/>
+            </w:pPr>
+            <w:r>
+              <w:rPr>
+                <w:rFonts w:ascii="Calibri" w:cs="Calibri" w:eastAsia="Calibri" w:hAnsi="Calibri"/>
+                <w:color w:val="0F172A"/>
+                <w:sz w:val="19"/>
+                <w:szCs w:val="19"/>
+              </w:rPr>
+              <w:t xml:space="preserve">61 007</w:t>
+            </w:r>
+          </w:p>
+        </w:tc>
+        <w:tc>
+          <w:tcPr>
+            <w:tcW w:type="dxa" w:w="100"/>
+            <w:tcMar>
+              <w:top w:type="dxa" w:w="70"/>
+              <w:left w:type="dxa" w:w="110"/>
+              <w:bottom w:type="dxa" w:w="70"/>
+              <w:right w:type="dxa" w:w="110"/>
+            </w:tcMar>
+          </w:tcPr>
+          <w:p>
+            <w:pPr>
+              <w:spacing w:after="0"/>
+              <w:jc w:val="center"/>
+            </w:pPr>
+            <w:r>
+              <w:rPr>
+                <w:rFonts w:ascii="Calibri" w:cs="Calibri" w:eastAsia="Calibri" w:hAnsi="Calibri"/>
+                <w:color w:val="0F172A"/>
+                <w:sz w:val="19"/>
+                <w:szCs w:val="19"/>
+              </w:rPr>
+              <w:t xml:space="preserve">2,9 %</w:t>
+            </w:r>
+          </w:p>
+        </w:tc>
+      </w:tr>
+      <w:tr>
+        <w:tc>
+          <w:tcPr>
+            <w:tcW w:type="dxa" w:w="100"/>
+            <w:tcMar>
+              <w:top w:type="dxa" w:w="70"/>
+              <w:left w:type="dxa" w:w="110"/>
+              <w:bottom w:type="dxa" w:w="70"/>
+              <w:right w:type="dxa" w:w="110"/>
+            </w:tcMar>
+          </w:tcPr>
+          <w:p>
+            <w:pPr>
+              <w:spacing w:after="0"/>
+              <w:jc w:val="left"/>
+            </w:pPr>
+            <w:r>
+              <w:rPr>
+                <w:rFonts w:ascii="Calibri" w:cs="Calibri" w:eastAsia="Calibri" w:hAnsi="Calibri"/>
+                <w:color w:val="0F172A"/>
+                <w:sz w:val="19"/>
+                <w:szCs w:val="19"/>
+              </w:rPr>
+              <w:t xml:space="preserve">Družstvá</w:t>
+            </w:r>
+          </w:p>
+        </w:tc>
+        <w:tc>
+          <w:tcPr>
+            <w:tcW w:type="dxa" w:w="100"/>
+            <w:tcMar>
+              <w:top w:type="dxa" w:w="70"/>
+              <w:left w:type="dxa" w:w="110"/>
+              <w:bottom w:type="dxa" w:w="70"/>
+              <w:right w:type="dxa" w:w="110"/>
+            </w:tcMar>
+          </w:tcPr>
+          <w:p>
+            <w:pPr>
+              <w:spacing w:after="0"/>
+              <w:jc w:val="center"/>
+            </w:pPr>
+            <w:r>
+              <w:rPr>
+                <w:rFonts w:ascii="Calibri" w:cs="Calibri" w:eastAsia="Calibri" w:hAnsi="Calibri"/>
+                <w:color w:val="0F172A"/>
+                <w:sz w:val="19"/>
+                <w:szCs w:val="19"/>
+              </w:rPr>
+              <w:t xml:space="preserve">2 326</w:t>
+            </w:r>
+          </w:p>
+        </w:tc>
+        <w:tc>
+          <w:tcPr>
+            <w:tcW w:type="dxa" w:w="100"/>
+            <w:tcMar>
+              <w:top w:type="dxa" w:w="70"/>
+              <w:left w:type="dxa" w:w="110"/>
+              <w:bottom w:type="dxa" w:w="70"/>
+              <w:right w:type="dxa" w:w="110"/>
+            </w:tcMar>
+          </w:tcPr>
+          <w:p>
+            <w:pPr>
+              <w:spacing w:after="0"/>
+              <w:jc w:val="center"/>
+            </w:pPr>
+            <w:r>
+              <w:rPr>
+                <w:rFonts w:ascii="Calibri" w:cs="Calibri" w:eastAsia="Calibri" w:hAnsi="Calibri"/>
+                <w:color w:val="0F172A"/>
+                <w:sz w:val="19"/>
+                <w:szCs w:val="19"/>
+              </w:rPr>
+              <w:t xml:space="preserve">5 686</w:t>
+            </w:r>
+          </w:p>
+        </w:tc>
+        <w:tc>
+          <w:tcPr>
+            <w:tcW w:type="dxa" w:w="100"/>
+            <w:tcMar>
+              <w:top w:type="dxa" w:w="70"/>
+              <w:left w:type="dxa" w:w="110"/>
+              <w:bottom w:type="dxa" w:w="70"/>
+              <w:right w:type="dxa" w:w="110"/>
+            </w:tcMar>
+          </w:tcPr>
+          <w:p>
+            <w:pPr>
+              <w:spacing w:after="0"/>
+              <w:jc w:val="center"/>
+            </w:pPr>
+            <w:r>
+              <w:rPr>
+                <w:rFonts w:ascii="Calibri" w:cs="Calibri" w:eastAsia="Calibri" w:hAnsi="Calibri"/>
+                <w:color w:val="0F172A"/>
+                <w:sz w:val="19"/>
+                <w:szCs w:val="19"/>
+              </w:rPr>
+              <w:t xml:space="preserve">40,9 %</w:t>
+            </w:r>
+          </w:p>
+        </w:tc>
+      </w:tr>
+      <w:tr>
+        <w:tc>
+          <w:tcPr>
+            <w:tcW w:type="dxa" w:w="100"/>
+            <w:tcMar>
+              <w:top w:type="dxa" w:w="70"/>
+              <w:left w:type="dxa" w:w="110"/>
+              <w:bottom w:type="dxa" w:w="70"/>
+              <w:right w:type="dxa" w:w="110"/>
+            </w:tcMar>
+          </w:tcPr>
+          <w:p>
+            <w:pPr>
+              <w:spacing w:after="0"/>
+              <w:jc w:val="left"/>
+            </w:pPr>
+            <w:r>
+              <w:rPr>
+                <w:rFonts w:ascii="Calibri" w:cs="Calibri" w:eastAsia="Calibri" w:hAnsi="Calibri"/>
+                <w:color w:val="0F172A"/>
+                <w:sz w:val="19"/>
+                <w:szCs w:val="19"/>
+              </w:rPr>
+              <w:t xml:space="preserve">Kluby s aspoň jedným zápasom</w:t>
+            </w:r>
+          </w:p>
+        </w:tc>
+        <w:tc>
+          <w:tcPr>
+            <w:tcW w:type="dxa" w:w="100"/>
+            <w:tcMar>
+              <w:top w:type="dxa" w:w="70"/>
+              <w:left w:type="dxa" w:w="110"/>
+              <w:bottom w:type="dxa" w:w="70"/>
+              <w:right w:type="dxa" w:w="110"/>
+            </w:tcMar>
+          </w:tcPr>
+          <w:p>
+            <w:pPr>
+              <w:spacing w:after="0"/>
+              <w:jc w:val="center"/>
+            </w:pPr>
+            <w:r>
+              <w:rPr>
+                <w:rFonts w:ascii="Calibri" w:cs="Calibri" w:eastAsia="Calibri" w:hAnsi="Calibri"/>
+                <w:color w:val="0F172A"/>
+                <w:sz w:val="19"/>
+                <w:szCs w:val="19"/>
+              </w:rPr>
+              <w:t xml:space="preserve">1 024</w:t>
+            </w:r>
+          </w:p>
+        </w:tc>
+        <w:tc>
+          <w:tcPr>
+            <w:tcW w:type="dxa" w:w="100"/>
+            <w:tcMar>
+              <w:top w:type="dxa" w:w="70"/>
+              <w:left w:type="dxa" w:w="110"/>
+              <w:bottom w:type="dxa" w:w="70"/>
+              <w:right w:type="dxa" w:w="110"/>
+            </w:tcMar>
+          </w:tcPr>
+          <w:p>
+            <w:pPr>
+              <w:spacing w:after="0"/>
+              <w:jc w:val="center"/>
+            </w:pPr>
+            <w:r>
+              <w:rPr>
+                <w:rFonts w:ascii="Calibri" w:cs="Calibri" w:eastAsia="Calibri" w:hAnsi="Calibri"/>
+                <w:color w:val="0F172A"/>
+                <w:sz w:val="19"/>
+                <w:szCs w:val="19"/>
+              </w:rPr>
+              <w:t xml:space="preserve">1 401</w:t>
+            </w:r>
+          </w:p>
+        </w:tc>
+        <w:tc>
+          <w:tcPr>
+            <w:tcW w:type="dxa" w:w="100"/>
+            <w:tcMar>
+              <w:top w:type="dxa" w:w="70"/>
+              <w:left w:type="dxa" w:w="110"/>
+              <w:bottom w:type="dxa" w:w="70"/>
+              <w:right w:type="dxa" w:w="110"/>
+            </w:tcMar>
+          </w:tcPr>
+          <w:p>
+            <w:pPr>
+              <w:spacing w:after="0"/>
+              <w:jc w:val="center"/>
+            </w:pPr>
+            <w:r>
+              <w:rPr>
+                <w:rFonts w:ascii="Calibri" w:cs="Calibri" w:eastAsia="Calibri" w:hAnsi="Calibri"/>
+                <w:color w:val="0F172A"/>
+                <w:sz w:val="19"/>
+                <w:szCs w:val="19"/>
+              </w:rPr>
+              <w:t xml:space="preserve">73,1 %</w:t>
+            </w:r>
+          </w:p>
+        </w:tc>
+      </w:tr>
+    </w:tbl>
+    <w:p>
+      <w:pPr>
+        <w:spacing w:after="160"/>
+      </w:pPr>
+      <w:r>
+        <w:rPr>
+          <w:rFonts w:ascii="Calibri" w:cs="Calibri" w:eastAsia="Calibri" w:hAnsi="Calibri"/>
+        </w:rPr>
+        <w:t xml:space="preserve"/>
+      </w:r>
+    </w:p>
+    <w:p>
+      <w:pPr>
+        <w:spacing w:after="140" w:line="276"/>
+      </w:pPr>
+      <w:r>
+        <w:rPr>
+          <w:rFonts w:ascii="Calibri" w:cs="Calibri" w:eastAsia="Calibri" w:hAnsi="Calibri"/>
+        </w:rPr>
+        <w:t xml:space="preserve">Prečo sa to hodnotiť nedá — rozbeh po vekových kategóriách:</w:t>
+      </w:r>
+    </w:p>
+    <w:tbl>
+      <w:tblPr>
+        <w:tblW w:type="dxa" w:w="9070"/>
+        <w:tblBorders>
+          <w:top w:val="single" w:color="E2E8F0" w:sz="4"/>
+          <w:left w:val="none"/>
+          <w:bottom w:val="single" w:color="E2E8F0" w:sz="4"/>
+          <w:right w:val="none"/>
+          <w:insideH w:val="single" w:color="E2E8F0" w:sz="2"/>
+          <w:insideV w:val="none"/>
+        </w:tblBorders>
+      </w:tblPr>
+      <w:tblGrid>
+        <w:gridCol w:w="3470"/>
+        <w:gridCol w:w="1900"/>
+        <w:gridCol w:w="1900"/>
+        <w:gridCol w:w="1800"/>
+      </w:tblGrid>
+      <w:tr>
+        <w:trPr>
+          <w:tblHeader/>
+        </w:trPr>
+        <w:tc>
+          <w:tcPr>
+            <w:tcW w:type="dxa" w:w="100"/>
+            <w:shd w:fill="EEF2F6" w:val="clear"/>
+            <w:tcMar>
+              <w:top w:type="dxa" w:w="70"/>
+              <w:left w:type="dxa" w:w="110"/>
+              <w:bottom w:type="dxa" w:w="70"/>
+              <w:right w:type="dxa" w:w="110"/>
+            </w:tcMar>
+          </w:tcPr>
+          <w:p>
+            <w:pPr>
+              <w:spacing w:after="0"/>
+              <w:jc w:val="left"/>
+            </w:pPr>
+            <w:r>
+              <w:rPr>
+                <w:rFonts w:ascii="Calibri" w:cs="Calibri" w:eastAsia="Calibri" w:hAnsi="Calibri"/>
+                <w:b/>
+                <w:bCs/>
+                <w:color w:val="0F172A"/>
+                <w:sz w:val="19"/>
+                <w:szCs w:val="19"/>
+              </w:rPr>
+              <w:t xml:space="preserve">Kategória</w:t>
+            </w:r>
+          </w:p>
+        </w:tc>
+        <w:tc>
+          <w:tcPr>
+            <w:tcW w:type="dxa" w:w="100"/>
+            <w:shd w:fill="EEF2F6" w:val="clear"/>
+            <w:tcMar>
+              <w:top w:type="dxa" w:w="70"/>
+              <w:left w:type="dxa" w:w="110"/>
+              <w:bottom w:type="dxa" w:w="70"/>
+              <w:right w:type="dxa" w:w="110"/>
+            </w:tcMar>
+          </w:tcPr>
+          <w:p>
+            <w:pPr>
+              <w:spacing w:after="0"/>
+              <w:jc w:val="center"/>
+            </w:pPr>
+            <w:r>
+              <w:rPr>
+                <w:rFonts w:ascii="Calibri" w:cs="Calibri" w:eastAsia="Calibri" w:hAnsi="Calibri"/>
+                <w:b/>
+                <w:bCs/>
+                <w:color w:val="0F172A"/>
+                <w:sz w:val="19"/>
+                <w:szCs w:val="19"/>
+              </w:rPr>
+              <w:t xml:space="preserve">2026/2027</w:t>
+            </w:r>
+          </w:p>
+        </w:tc>
+        <w:tc>
+          <w:tcPr>
+            <w:tcW w:type="dxa" w:w="100"/>
+            <w:shd w:fill="EEF2F6" w:val="clear"/>
+            <w:tcMar>
+              <w:top w:type="dxa" w:w="70"/>
+              <w:left w:type="dxa" w:w="110"/>
+              <w:bottom w:type="dxa" w:w="70"/>
+              <w:right w:type="dxa" w:w="110"/>
+            </w:tcMar>
+          </w:tcPr>
+          <w:p>
+            <w:pPr>
+              <w:spacing w:after="0"/>
+              <w:jc w:val="center"/>
+            </w:pPr>
+            <w:r>
+              <w:rPr>
+                <w:rFonts w:ascii="Calibri" w:cs="Calibri" w:eastAsia="Calibri" w:hAnsi="Calibri"/>
+                <w:b/>
+                <w:bCs/>
+                <w:color w:val="0F172A"/>
+                <w:sz w:val="19"/>
+                <w:szCs w:val="19"/>
+              </w:rPr>
+              <w:t xml:space="preserve">2025/2026 (celá)</w:t>
+            </w:r>
+          </w:p>
+        </w:tc>
+        <w:tc>
+          <w:tcPr>
+            <w:tcW w:type="dxa" w:w="100"/>
+            <w:shd w:fill="EEF2F6" w:val="clear"/>
+            <w:tcMar>
+              <w:top w:type="dxa" w:w="70"/>
+              <w:left w:type="dxa" w:w="110"/>
+              <w:bottom w:type="dxa" w:w="70"/>
+              <w:right w:type="dxa" w:w="110"/>
+            </w:tcMar>
+          </w:tcPr>
+          <w:p>
+            <w:pPr>
+              <w:spacing w:after="0"/>
+              <w:jc w:val="center"/>
+            </w:pPr>
+            <w:r>
+              <w:rPr>
+                <w:rFonts w:ascii="Calibri" w:cs="Calibri" w:eastAsia="Calibri" w:hAnsi="Calibri"/>
+                <w:b/>
+                <w:bCs/>
+                <w:color w:val="0F172A"/>
+                <w:sz w:val="19"/>
+                <w:szCs w:val="19"/>
+              </w:rPr>
+              <w:t xml:space="preserve">Rozbeh</w:t>
+            </w:r>
+          </w:p>
+        </w:tc>
+      </w:tr>
+      <w:tr>
+        <w:tc>
+          <w:tcPr>
+            <w:tcW w:type="dxa" w:w="100"/>
+            <w:tcMar>
+              <w:top w:type="dxa" w:w="70"/>
+              <w:left w:type="dxa" w:w="110"/>
+              <w:bottom w:type="dxa" w:w="70"/>
+              <w:right w:type="dxa" w:w="110"/>
+            </w:tcMar>
+          </w:tcPr>
+          <w:p>
+            <w:pPr>
+              <w:spacing w:after="0"/>
+              <w:jc w:val="left"/>
+            </w:pPr>
+            <w:r>
+              <w:rPr>
+                <w:rFonts w:ascii="Calibri" w:cs="Calibri" w:eastAsia="Calibri" w:hAnsi="Calibri"/>
+                <w:color w:val="0F172A"/>
+                <w:sz w:val="19"/>
+                <w:szCs w:val="19"/>
+              </w:rPr>
+              <w:t xml:space="preserve">Dospelí</w:t>
+            </w:r>
+          </w:p>
+        </w:tc>
+        <w:tc>
+          <w:tcPr>
+            <w:tcW w:type="dxa" w:w="100"/>
+            <w:tcMar>
+              <w:top w:type="dxa" w:w="70"/>
+              <w:left w:type="dxa" w:w="110"/>
+              <w:bottom w:type="dxa" w:w="70"/>
+              <w:right w:type="dxa" w:w="110"/>
+            </w:tcMar>
+          </w:tcPr>
+          <w:p>
+            <w:pPr>
+              <w:spacing w:after="0"/>
+              <w:jc w:val="center"/>
+            </w:pPr>
+            <w:r>
+              <w:rPr>
+                <w:rFonts w:ascii="Calibri" w:cs="Calibri" w:eastAsia="Calibri" w:hAnsi="Calibri"/>
+                <w:color w:val="0F172A"/>
+                <w:sz w:val="19"/>
+                <w:szCs w:val="19"/>
+              </w:rPr>
+              <w:t xml:space="preserve">1 007</w:t>
+            </w:r>
+          </w:p>
+        </w:tc>
+        <w:tc>
+          <w:tcPr>
+            <w:tcW w:type="dxa" w:w="100"/>
+            <w:tcMar>
+              <w:top w:type="dxa" w:w="70"/>
+              <w:left w:type="dxa" w:w="110"/>
+              <w:bottom w:type="dxa" w:w="70"/>
+              <w:right w:type="dxa" w:w="110"/>
+            </w:tcMar>
+          </w:tcPr>
+          <w:p>
+            <w:pPr>
+              <w:spacing w:after="0"/>
+              <w:jc w:val="center"/>
+            </w:pPr>
+            <w:r>
+              <w:rPr>
+                <w:rFonts w:ascii="Calibri" w:cs="Calibri" w:eastAsia="Calibri" w:hAnsi="Calibri"/>
+                <w:color w:val="0F172A"/>
+                <w:sz w:val="19"/>
+                <w:szCs w:val="19"/>
+              </w:rPr>
+              <w:t xml:space="preserve">1 320</w:t>
+            </w:r>
+          </w:p>
+        </w:tc>
+        <w:tc>
+          <w:tcPr>
+            <w:tcW w:type="dxa" w:w="100"/>
+            <w:tcMar>
+              <w:top w:type="dxa" w:w="70"/>
+              <w:left w:type="dxa" w:w="110"/>
+              <w:bottom w:type="dxa" w:w="70"/>
+              <w:right w:type="dxa" w:w="110"/>
+            </w:tcMar>
+          </w:tcPr>
+          <w:p>
+            <w:pPr>
+              <w:spacing w:after="0"/>
+              <w:jc w:val="center"/>
+            </w:pPr>
+            <w:r>
+              <w:rPr>
+                <w:rFonts w:ascii="Calibri" w:cs="Calibri" w:eastAsia="Calibri" w:hAnsi="Calibri"/>
+                <w:color w:val="0F172A"/>
+                <w:sz w:val="19"/>
+                <w:szCs w:val="19"/>
+              </w:rPr>
+              <w:t xml:space="preserve">76,3 %</w:t>
+            </w:r>
+          </w:p>
+        </w:tc>
+      </w:tr>
+      <w:tr>
+        <w:tc>
+          <w:tcPr>
+            <w:tcW w:type="dxa" w:w="100"/>
+            <w:tcMar>
+              <w:top w:type="dxa" w:w="70"/>
+              <w:left w:type="dxa" w:w="110"/>
+              <w:bottom w:type="dxa" w:w="70"/>
+              <w:right w:type="dxa" w:w="110"/>
+            </w:tcMar>
+          </w:tcPr>
+          <w:p>
+            <w:pPr>
+              <w:spacing w:after="0"/>
+              <w:jc w:val="left"/>
+            </w:pPr>
+            <w:r>
+              <w:rPr>
+                <w:rFonts w:ascii="Calibri" w:cs="Calibri" w:eastAsia="Calibri" w:hAnsi="Calibri"/>
+                <w:color w:val="0F172A"/>
+                <w:sz w:val="19"/>
+                <w:szCs w:val="19"/>
+              </w:rPr>
+              <w:t xml:space="preserve">Dorast</w:t>
+            </w:r>
+          </w:p>
+        </w:tc>
+        <w:tc>
+          <w:tcPr>
+            <w:tcW w:type="dxa" w:w="100"/>
+            <w:tcMar>
+              <w:top w:type="dxa" w:w="70"/>
+              <w:left w:type="dxa" w:w="110"/>
+              <w:bottom w:type="dxa" w:w="70"/>
+              <w:right w:type="dxa" w:w="110"/>
+            </w:tcMar>
+          </w:tcPr>
+          <w:p>
+            <w:pPr>
+              <w:spacing w:after="0"/>
+              <w:jc w:val="center"/>
+            </w:pPr>
+            <w:r>
+              <w:rPr>
+                <w:rFonts w:ascii="Calibri" w:cs="Calibri" w:eastAsia="Calibri" w:hAnsi="Calibri"/>
+                <w:color w:val="0F172A"/>
+                <w:sz w:val="19"/>
+                <w:szCs w:val="19"/>
+              </w:rPr>
+              <w:t xml:space="preserve">487</w:t>
+            </w:r>
+          </w:p>
+        </w:tc>
+        <w:tc>
+          <w:tcPr>
+            <w:tcW w:type="dxa" w:w="100"/>
+            <w:tcMar>
+              <w:top w:type="dxa" w:w="70"/>
+              <w:left w:type="dxa" w:w="110"/>
+              <w:bottom w:type="dxa" w:w="70"/>
+              <w:right w:type="dxa" w:w="110"/>
+            </w:tcMar>
+          </w:tcPr>
+          <w:p>
+            <w:pPr>
+              <w:spacing w:after="0"/>
+              <w:jc w:val="center"/>
+            </w:pPr>
+            <w:r>
+              <w:rPr>
+                <w:rFonts w:ascii="Calibri" w:cs="Calibri" w:eastAsia="Calibri" w:hAnsi="Calibri"/>
+                <w:color w:val="0F172A"/>
+                <w:sz w:val="19"/>
+                <w:szCs w:val="19"/>
+              </w:rPr>
+              <w:t xml:space="preserve">803</w:t>
+            </w:r>
+          </w:p>
+        </w:tc>
+        <w:tc>
+          <w:tcPr>
+            <w:tcW w:type="dxa" w:w="100"/>
+            <w:tcMar>
+              <w:top w:type="dxa" w:w="70"/>
+              <w:left w:type="dxa" w:w="110"/>
+              <w:bottom w:type="dxa" w:w="70"/>
+              <w:right w:type="dxa" w:w="110"/>
+            </w:tcMar>
+          </w:tcPr>
+          <w:p>
+            <w:pPr>
+              <w:spacing w:after="0"/>
+              <w:jc w:val="center"/>
+            </w:pPr>
+            <w:r>
+              <w:rPr>
+                <w:rFonts w:ascii="Calibri" w:cs="Calibri" w:eastAsia="Calibri" w:hAnsi="Calibri"/>
+                <w:color w:val="0F172A"/>
+                <w:sz w:val="19"/>
+                <w:szCs w:val="19"/>
+              </w:rPr>
+              <w:t xml:space="preserve">60,6 %</w:t>
+            </w:r>
+          </w:p>
+        </w:tc>
+      </w:tr>
+      <w:tr>
+        <w:tc>
+          <w:tcPr>
+            <w:tcW w:type="dxa" w:w="100"/>
+            <w:tcMar>
+              <w:top w:type="dxa" w:w="70"/>
+              <w:left w:type="dxa" w:w="110"/>
+              <w:bottom w:type="dxa" w:w="70"/>
+              <w:right w:type="dxa" w:w="110"/>
+            </w:tcMar>
+          </w:tcPr>
+          <w:p>
+            <w:pPr>
+              <w:spacing w:after="0"/>
+              <w:jc w:val="left"/>
+            </w:pPr>
+            <w:r>
+              <w:rPr>
+                <w:rFonts w:ascii="Calibri" w:cs="Calibri" w:eastAsia="Calibri" w:hAnsi="Calibri"/>
+                <w:color w:val="0F172A"/>
+                <w:sz w:val="19"/>
+                <w:szCs w:val="19"/>
+              </w:rPr>
+              <w:t xml:space="preserve">Žiaci</w:t>
+            </w:r>
+          </w:p>
+        </w:tc>
+        <w:tc>
+          <w:tcPr>
+            <w:tcW w:type="dxa" w:w="100"/>
+            <w:tcMar>
+              <w:top w:type="dxa" w:w="70"/>
+              <w:left w:type="dxa" w:w="110"/>
+              <w:bottom w:type="dxa" w:w="70"/>
+              <w:right w:type="dxa" w:w="110"/>
+            </w:tcMar>
+          </w:tcPr>
+          <w:p>
+            <w:pPr>
+              <w:spacing w:after="0"/>
+              <w:jc w:val="center"/>
+            </w:pPr>
+            <w:r>
+              <w:rPr>
+                <w:rFonts w:ascii="Calibri" w:cs="Calibri" w:eastAsia="Calibri" w:hAnsi="Calibri"/>
+                <w:color w:val="0F172A"/>
+                <w:sz w:val="19"/>
+                <w:szCs w:val="19"/>
+              </w:rPr>
+              <w:t xml:space="preserve">416</w:t>
+            </w:r>
+          </w:p>
+        </w:tc>
+        <w:tc>
+          <w:tcPr>
+            <w:tcW w:type="dxa" w:w="100"/>
+            <w:tcMar>
+              <w:top w:type="dxa" w:w="70"/>
+              <w:left w:type="dxa" w:w="110"/>
+              <w:bottom w:type="dxa" w:w="70"/>
+              <w:right w:type="dxa" w:w="110"/>
+            </w:tcMar>
+          </w:tcPr>
+          <w:p>
+            <w:pPr>
+              <w:spacing w:after="0"/>
+              <w:jc w:val="center"/>
+            </w:pPr>
+            <w:r>
+              <w:rPr>
+                <w:rFonts w:ascii="Calibri" w:cs="Calibri" w:eastAsia="Calibri" w:hAnsi="Calibri"/>
+                <w:color w:val="0F172A"/>
+                <w:sz w:val="19"/>
+                <w:szCs w:val="19"/>
+              </w:rPr>
+              <w:t xml:space="preserve">1 611</w:t>
+            </w:r>
+          </w:p>
+        </w:tc>
+        <w:tc>
+          <w:tcPr>
+            <w:tcW w:type="dxa" w:w="100"/>
+            <w:tcMar>
+              <w:top w:type="dxa" w:w="70"/>
+              <w:left w:type="dxa" w:w="110"/>
+              <w:bottom w:type="dxa" w:w="70"/>
+              <w:right w:type="dxa" w:w="110"/>
+            </w:tcMar>
+          </w:tcPr>
+          <w:p>
+            <w:pPr>
+              <w:spacing w:after="0"/>
+              <w:jc w:val="center"/>
+            </w:pPr>
+            <w:r>
+              <w:rPr>
+                <w:rFonts w:ascii="Calibri" w:cs="Calibri" w:eastAsia="Calibri" w:hAnsi="Calibri"/>
+                <w:color w:val="0F172A"/>
+                <w:sz w:val="19"/>
+                <w:szCs w:val="19"/>
+              </w:rPr>
+              <w:t xml:space="preserve">25,8 %</w:t>
+            </w:r>
+          </w:p>
+        </w:tc>
+      </w:tr>
+      <w:tr>
+        <w:tc>
+          <w:tcPr>
+            <w:tcW w:type="dxa" w:w="100"/>
+            <w:tcMar>
+              <w:top w:type="dxa" w:w="70"/>
+              <w:left w:type="dxa" w:w="110"/>
+              <w:bottom w:type="dxa" w:w="70"/>
+              <w:right w:type="dxa" w:w="110"/>
+            </w:tcMar>
+          </w:tcPr>
+          <w:p>
+            <w:pPr>
+              <w:spacing w:after="0"/>
+              <w:jc w:val="left"/>
+            </w:pPr>
+            <w:r>
+              <w:rPr>
+                <w:rFonts w:ascii="Calibri" w:cs="Calibri" w:eastAsia="Calibri" w:hAnsi="Calibri"/>
+                <w:b/>
+                <w:bCs/>
+                <w:color w:val="0F172A"/>
+                <w:sz w:val="19"/>
+                <w:szCs w:val="19"/>
+              </w:rPr>
+              <w:t xml:space="preserve">Prípravka</w:t>
+            </w:r>
+          </w:p>
+        </w:tc>
+        <w:tc>
+          <w:tcPr>
+            <w:tcW w:type="dxa" w:w="100"/>
+            <w:tcMar>
+              <w:top w:type="dxa" w:w="70"/>
+              <w:left w:type="dxa" w:w="110"/>
+              <w:bottom w:type="dxa" w:w="70"/>
+              <w:right w:type="dxa" w:w="110"/>
+            </w:tcMar>
+          </w:tcPr>
+          <w:p>
+            <w:pPr>
+              <w:spacing w:after="0"/>
+              <w:jc w:val="center"/>
+            </w:pPr>
+            <w:r>
+              <w:rPr>
+                <w:rFonts w:ascii="Calibri" w:cs="Calibri" w:eastAsia="Calibri" w:hAnsi="Calibri"/>
+                <w:b/>
+                <w:bCs/>
+                <w:color w:val="0F172A"/>
+                <w:sz w:val="19"/>
+                <w:szCs w:val="19"/>
+              </w:rPr>
+              <w:t xml:space="preserve">32</w:t>
+            </w:r>
+          </w:p>
+        </w:tc>
+        <w:tc>
+          <w:tcPr>
+            <w:tcW w:type="dxa" w:w="100"/>
+            <w:tcMar>
+              <w:top w:type="dxa" w:w="70"/>
+              <w:left w:type="dxa" w:w="110"/>
+              <w:bottom w:type="dxa" w:w="70"/>
+              <w:right w:type="dxa" w:w="110"/>
+            </w:tcMar>
+          </w:tcPr>
+          <w:p>
+            <w:pPr>
+              <w:spacing w:after="0"/>
+              <w:jc w:val="center"/>
+            </w:pPr>
+            <w:r>
+              <w:rPr>
+                <w:rFonts w:ascii="Calibri" w:cs="Calibri" w:eastAsia="Calibri" w:hAnsi="Calibri"/>
+                <w:b/>
+                <w:bCs/>
+                <w:color w:val="0F172A"/>
+                <w:sz w:val="19"/>
+                <w:szCs w:val="19"/>
+              </w:rPr>
+              <w:t xml:space="preserve">1 712</w:t>
+            </w:r>
+          </w:p>
+        </w:tc>
+        <w:tc>
+          <w:tcPr>
+            <w:tcW w:type="dxa" w:w="100"/>
+            <w:tcMar>
+              <w:top w:type="dxa" w:w="70"/>
+              <w:left w:type="dxa" w:w="110"/>
+              <w:bottom w:type="dxa" w:w="70"/>
+              <w:right w:type="dxa" w:w="110"/>
+            </w:tcMar>
+          </w:tcPr>
+          <w:p>
+            <w:pPr>
+              <w:spacing w:after="0"/>
+              <w:jc w:val="center"/>
+            </w:pPr>
+            <w:r>
+              <w:rPr>
+                <w:rFonts w:ascii="Calibri" w:cs="Calibri" w:eastAsia="Calibri" w:hAnsi="Calibri"/>
+                <w:b/>
+                <w:bCs/>
+                <w:color w:val="0F172A"/>
+                <w:sz w:val="19"/>
+                <w:szCs w:val="19"/>
+              </w:rPr>
+              <w:t xml:space="preserve">1,9 %</w:t>
+            </w:r>
+          </w:p>
+        </w:tc>
+      </w:tr>
+    </w:tbl>
+    <w:p>
+      <w:pPr>
+        <w:spacing w:after="160"/>
+      </w:pPr>
+      <w:r>
+        <w:rPr>
+          <w:rFonts w:ascii="Calibri" w:cs="Calibri" w:eastAsia="Calibri" w:hAnsi="Calibri"/>
+        </w:rPr>
+        <w:t xml:space="preserve"/>
+      </w:r>
+    </w:p>
+    <w:p>
+      <w:pPr>
+        <w:spacing w:after="140" w:line="276"/>
+      </w:pPr>
+      <w:r>
+        <w:rPr>
+          <w:rFonts w:ascii="Calibri" w:cs="Calibri" w:eastAsia="Calibri" w:hAnsi="Calibri"/>
+        </w:rPr>
+        <w:t xml:space="preserve">Súťaže sa rozbiehajú v poradí dospelí → dorast → žiaci → prípravky, mládež má štart o týždne neskôr. </w:t>
+      </w:r>
+      <w:r>
+        <w:rPr>
+          <w:rFonts w:ascii="Calibri" w:cs="Calibri" w:eastAsia="Calibri" w:hAnsi="Calibri"/>
+          <w:b/>
+          <w:bCs/>
+        </w:rPr>
+        <w:t xml:space="preserve">Bez odohraného zápasu je zatiaľ 382 klubov — a toto číslo NIE JE počet odstúpených klubov.</w:t>
+      </w:r>
+      <w:r>
+        <w:rPr>
+          <w:rFonts w:ascii="Calibri" w:cs="Calibri" w:eastAsia="Calibri" w:hAnsi="Calibri"/>
+        </w:rPr>
+        <w:t xml:space="preserve"> Prípraviek hrá 1,9 % a žiakov 25,8 %, takže väčšina tých klubov len čaká na štart svojej súťaže. Je to presne to číslo, ktoré by rétoriku o hromadnom odhlasovaní zdanlivo potvrdilo, preto sa tak nesmie použiť ani interne. Počet odstúpených klubov za sezónu 2026/2027 budeme vedieť po jesennej časti.</w:t>
+      </w:r>
+    </w:p>
+    <w:p>
+      <w:pPr>
         <w:pStyle w:val="Heading1"/>
         <w:spacing w:after="160" w:before="300"/>
       </w:pPr>
@@ -5605,13 +6944,13 @@
           <w:b/>
           <w:bCs/>
         </w:rPr>
-        <w:t xml:space="preserve">Prebiehajúca sezóna 2026/2027 v analýze nie je. </w:t>
-      </w:r>
-      <w:r>
-        <w:rPr>
-          <w:rFonts w:ascii="Calibri" w:cs="Calibri" w:eastAsia="Calibri" w:hAnsi="Calibri"/>
-        </w:rPr>
-        <w:t xml:space="preserve">V nej má nula odohraných zápasov 40 klubov, ale väčšina z nich len čaká na štart svojej súťaže. Toto číslo sa nedá použiť ako počet odstúpených klubov a treba naň dávať pozor — je to presne to číslo, ktoré by rétoriku o hromadnom odhlasovaní zdanlivo potvrdilo.</w:t>
+        <w:t xml:space="preserve">Prebiehajúca sezóna 2026/2027 sa vykazuje len ako rozbeh. </w:t>
+      </w:r>
+      <w:r>
+        <w:rPr>
+          <w:rFonts w:ascii="Calibri" w:cs="Calibri" w:eastAsia="Calibri" w:hAnsi="Calibri"/>
+        </w:rPr>
+        <w:t xml:space="preserve">Počet odstúpených klubov sa v rozbehnutej sezóne merať nedá. Bez odohraného zápasu je zatiaľ 382 klubov, ale prípraviek hrá 1,9 % a žiakov 25,8 % — väčšina tých klubov len čaká na štart svojej súťaže. Toto číslo sa nedá použiť ako počet odstúpených klubov a treba naň dávať pozor — je to presne to číslo, ktoré by rétoriku o hromadnom odhlasovaní zdanlivo potvrdilo. Pravidlo je zapísané v docs/metodika.md.</w:t>
       </w:r>
     </w:p>
     <w:p>
@@ -5708,7 +7047,7 @@
       <w:r>
         <w:drawing>
           <wp:inline distT="0" distB="0" distL="0" distR="0">
-            <wp:extent cx="8953500" cy="4924425"/>
+            <wp:extent cx="7096125" cy="4838700"/>
             <wp:effectExtent t="0" r="0" b="0" l="0"/>
             <wp:docPr id="1" name="" descr="" title=""/>
             <wp:cNvGraphicFramePr>
@@ -5733,7 +7072,7 @@
                   <pic:spPr bwMode="auto">
                     <a:xfrm>
                       <a:off x="0" y="0"/>
-                      <a:ext cx="8953500" cy="4924425"/>
+                      <a:ext cx="7096125" cy="4838700"/>
                     </a:xfrm>
                     <a:prstGeom prst="rect">
                       <a:avLst/>
@@ -5759,7 +7098,7 @@
           <w:sz w:val="17"/>
           <w:szCs w:val="17"/>
         </w:rPr>
-        <w:t xml:space="preserve">Číslo v políčku je počet klubov, ktoré v danej sezóne odstúpili a naposledy hrali v súťažiach daného zväzu. Zväz = ten, v ktorého súťažiach klub odohral najviac zápasov v poslednej sezóne. Prebiehajúca sezóna sa nehodnotí. Zdroj: ISSF.</w:t>
+        <w:t xml:space="preserve">Číslo v políčku je počet klubov, ktoré v danej sezóne odstúpili a naposledy hrali v súťažiach daného zväzu. Zväz = ten, v ktorého súťažiach klub odohral najviac zápasov v poslednej sezóne. Sezóna 2026/2027 je uvedená len ako rozbeh, nie ako počet odstúpených klubov. Zdroj: ISSF.</w:t>
       </w:r>
     </w:p>
     <w:sectPr>

</xml_diff>